<commit_message>
Place project in position to submit
</commit_message>
<xml_diff>
--- a/AISearchProforma.docx
+++ b/AISearchProforma.docx
@@ -33,7 +33,14 @@
       </w:pPr>
       <w:r>
         <w:rPr/>
-        <w:t>Algorithm A: A Star with Iterative Deepening</w:t>
+        <w:t xml:space="preserve">Algorithm A: </w:t>
+      </w:r>
+      <w:r>
+        <w:rPr/>
+        <w:t>IA (A* with iterative deepening)</w:t>
+      </w:r>
+      <w:r>
+        <w:rPr/>
         <w:tab/>
       </w:r>
     </w:p>
@@ -50,7 +57,19 @@
       </w:pPr>
       <w:r>
         <w:rPr/>
-        <w:t>Algorithm B: Basic Greedy Search</w:t>
+        <w:t xml:space="preserve">Algorithm B: </w:t>
+      </w:r>
+      <w:r>
+        <w:rPr/>
+        <w:t>BG (</w:t>
+      </w:r>
+      <w:r>
+        <w:rPr/>
+        <w:t>Basic Greedy Search</w:t>
+      </w:r>
+      <w:r>
+        <w:rPr/>
+        <w:t>)</w:t>
       </w:r>
     </w:p>
     <w:p>
@@ -68,7 +87,7 @@
         <mc:AlternateContent>
           <mc:Choice Requires="wps">
             <w:drawing>
-              <wp:anchor behindDoc="0" distT="40005" distB="60960" distL="109220" distR="126365" simplePos="0" locked="0" layoutInCell="0" allowOverlap="1" relativeHeight="2" wp14:anchorId="0DDCE53D">
+              <wp:anchor behindDoc="0" distT="40005" distB="60325" distL="109220" distR="125730" simplePos="0" locked="0" layoutInCell="0" allowOverlap="1" relativeHeight="2" wp14:anchorId="0DDCE53D">
                 <wp:simplePos x="0" y="0"/>
                 <wp:positionH relativeFrom="margin">
                   <wp:posOffset>-803910</wp:posOffset>
@@ -127,7 +146,39 @@
                                 <w:iCs/>
                                 <w:color w:val="000000"/>
                               </w:rPr>
-                              <w:t>Note: Both Enhancement 1 and 2 involved modification of the original prims_heuristic() function. This function was subsequently renamed to pruned_prims_heuristic() to reflect its function.</w:t>
+                              <w:t xml:space="preserve">Note: Both Enhancement 1 and 2 involved modification of the original prims_heuristic() function. This function was subsequently renamed to pruned_prims_heuristic() to reflect its </w:t>
+                            </w:r>
+                            <w:r>
+                              <w:rPr>
+                                <w:i/>
+                                <w:iCs/>
+                                <w:color w:val="000000"/>
+                              </w:rPr>
+                              <w:t>enhanced</w:t>
+                            </w:r>
+                            <w:r>
+                              <w:rPr>
+                                <w:i/>
+                                <w:iCs/>
+                                <w:color w:val="000000"/>
+                              </w:rPr>
+                              <w:t xml:space="preserve"> function</w:t>
+                            </w:r>
+                            <w:r>
+                              <w:rPr>
+                                <w:i/>
+                                <w:iCs/>
+                                <w:color w:val="000000"/>
+                              </w:rPr>
+                              <w:t>ality</w:t>
+                            </w:r>
+                            <w:r>
+                              <w:rPr>
+                                <w:i/>
+                                <w:iCs/>
+                                <w:color w:val="000000"/>
+                              </w:rPr>
+                              <w:t>.</w:t>
                             </w:r>
                           </w:p>
                           <w:p>
@@ -289,7 +340,39 @@
                           <w:iCs/>
                           <w:color w:val="000000"/>
                         </w:rPr>
-                        <w:t>Note: Both Enhancement 1 and 2 involved modification of the original prims_heuristic() function. This function was subsequently renamed to pruned_prims_heuristic() to reflect its function.</w:t>
+                        <w:t xml:space="preserve">Note: Both Enhancement 1 and 2 involved modification of the original prims_heuristic() function. This function was subsequently renamed to pruned_prims_heuristic() to reflect its </w:t>
+                      </w:r>
+                      <w:r>
+                        <w:rPr>
+                          <w:i/>
+                          <w:iCs/>
+                          <w:color w:val="000000"/>
+                        </w:rPr>
+                        <w:t>enhanced</w:t>
+                      </w:r>
+                      <w:r>
+                        <w:rPr>
+                          <w:i/>
+                          <w:iCs/>
+                          <w:color w:val="000000"/>
+                        </w:rPr>
+                        <w:t xml:space="preserve"> function</w:t>
+                      </w:r>
+                      <w:r>
+                        <w:rPr>
+                          <w:i/>
+                          <w:iCs/>
+                          <w:color w:val="000000"/>
+                        </w:rPr>
+                        <w:t>ality</w:t>
+                      </w:r>
+                      <w:r>
+                        <w:rPr>
+                          <w:i/>
+                          <w:iCs/>
+                          <w:color w:val="000000"/>
+                        </w:rPr>
+                        <w:t>.</w:t>
                       </w:r>
                     </w:p>
                     <w:p>
@@ -444,7 +527,7 @@
         <mc:AlternateContent>
           <mc:Choice Requires="wps">
             <w:drawing>
-              <wp:anchor behindDoc="0" distT="37465" distB="62865" distL="109220" distR="118745" simplePos="0" locked="0" layoutInCell="0" allowOverlap="1" relativeHeight="4" wp14:anchorId="395F7EF3">
+              <wp:anchor behindDoc="0" distT="36830" distB="62865" distL="109220" distR="118110" simplePos="0" locked="0" layoutInCell="0" allowOverlap="1" relativeHeight="4" wp14:anchorId="395F7EF3">
                 <wp:simplePos x="0" y="0"/>
                 <wp:positionH relativeFrom="margin">
                   <wp:posOffset>-811530</wp:posOffset>
@@ -664,23 +747,7 @@
                                 <w:iCs w:val="false"/>
                                 <w:color w:val="000000"/>
                               </w:rPr>
-                              <w:t xml:space="preserve"> variable to obtain an enhanced tour. 2-OPT works by iterating over all the pairs edges in the tour and examining whether </w:t>
-                            </w:r>
-                            <w:r>
-                              <w:rPr>
-                                <w:i w:val="false"/>
-                                <w:iCs w:val="false"/>
-                                <w:color w:val="000000"/>
-                              </w:rPr>
-                              <w:t>reversing the order of two cities in the tour</w:t>
-                            </w:r>
-                            <w:r>
-                              <w:rPr>
-                                <w:i w:val="false"/>
-                                <w:iCs w:val="false"/>
-                                <w:color w:val="000000"/>
-                              </w:rPr>
-                              <w:t xml:space="preserve"> would result in a tour with a lower path cost. If it would, the tour is subsequently modified to reflect the swap. Combined with enhancments 1A and 1B, this greatly improved tour quality, with the quality of tours found from the enhanced greedy algorithm now being on a similar level to the quality of tours discovered with the iterative depeening A* search.</w:t>
+                              <w:t xml:space="preserve"> variable to obtain an enhanced tour. 2-OPT works by iterating over all the pairs edges in the tour and examining whether reversing the order of two cities in the tour would result in a tour with a lower path cost. If it would, the tour is subsequently modified to reflect the swap. Combined with enhancments 1A and 1B, this greatly improved tour quality, with the quality of tours found from the enhanced greedy algorithm now being on a similar level to the quality of tours discovered with the iterative depeening A* search.</w:t>
                             </w:r>
                           </w:p>
                         </w:txbxContent>
@@ -879,23 +946,7 @@
                           <w:iCs w:val="false"/>
                           <w:color w:val="000000"/>
                         </w:rPr>
-                        <w:t xml:space="preserve"> variable to obtain an enhanced tour. 2-OPT works by iterating over all the pairs edges in the tour and examining whether </w:t>
-                      </w:r>
-                      <w:r>
-                        <w:rPr>
-                          <w:i w:val="false"/>
-                          <w:iCs w:val="false"/>
-                          <w:color w:val="000000"/>
-                        </w:rPr>
-                        <w:t>reversing the order of two cities in the tour</w:t>
-                      </w:r>
-                      <w:r>
-                        <w:rPr>
-                          <w:i w:val="false"/>
-                          <w:iCs w:val="false"/>
-                          <w:color w:val="000000"/>
-                        </w:rPr>
-                        <w:t xml:space="preserve"> would result in a tour with a lower path cost. If it would, the tour is subsequently modified to reflect the swap. Combined with enhancments 1A and 1B, this greatly improved tour quality, with the quality of tours found from the enhanced greedy algorithm now being on a similar level to the quality of tours discovered with the iterative depeening A* search.</w:t>
+                        <w:t xml:space="preserve"> variable to obtain an enhanced tour. 2-OPT works by iterating over all the pairs edges in the tour and examining whether reversing the order of two cities in the tour would result in a tour with a lower path cost. If it would, the tour is subsequently modified to reflect the swap. Combined with enhancments 1A and 1B, this greatly improved tour quality, with the quality of tours found from the enhanced greedy algorithm now being on a similar level to the quality of tours discovered with the iterative depeening A* search.</w:t>
                       </w:r>
                     </w:p>
                   </w:txbxContent>
@@ -967,7 +1018,7 @@
         <mc:AlternateContent>
           <mc:Choice Requires="wps">
             <w:drawing>
-              <wp:anchor behindDoc="0" distT="40005" distB="64135" distL="106045" distR="124460" simplePos="0" locked="0" layoutInCell="0" allowOverlap="1" relativeHeight="6" wp14:anchorId="7F7DBDF3">
+              <wp:anchor behindDoc="0" distT="40005" distB="64135" distL="105410" distR="124460" simplePos="0" locked="0" layoutInCell="0" allowOverlap="1" relativeHeight="6" wp14:anchorId="7F7DBDF3">
                 <wp:simplePos x="0" y="0"/>
                 <wp:positionH relativeFrom="margin">
                   <wp:posOffset>-819150</wp:posOffset>

</xml_diff>

<commit_message>
Further advance submission progress
</commit_message>
<xml_diff>
--- a/AISearchProforma.docx
+++ b/AISearchProforma.docx
@@ -33,14 +33,15 @@
       </w:pPr>
       <w:r>
         <w:rPr/>
-        <w:t xml:space="preserve">Algorithm A: </w:t>
+        <w:t xml:space="preserve">Algorithm A: IA (A* </w:t>
       </w:r>
       <w:r>
         <w:rPr/>
-        <w:t>IA (A* with iterative deepening)</w:t>
+        <w:t xml:space="preserve">search </w:t>
       </w:r>
       <w:r>
         <w:rPr/>
+        <w:t>with iterative deepening)</w:t>
         <w:tab/>
       </w:r>
     </w:p>
@@ -57,19 +58,7 @@
       </w:pPr>
       <w:r>
         <w:rPr/>
-        <w:t xml:space="preserve">Algorithm B: </w:t>
-      </w:r>
-      <w:r>
-        <w:rPr/>
-        <w:t>BG (</w:t>
-      </w:r>
-      <w:r>
-        <w:rPr/>
-        <w:t>Basic Greedy Search</w:t>
-      </w:r>
-      <w:r>
-        <w:rPr/>
-        <w:t>)</w:t>
+        <w:t>Algorithm B: BG (Basic Greedy Search)</w:t>
       </w:r>
     </w:p>
     <w:p>
@@ -87,7 +76,7 @@
         <mc:AlternateContent>
           <mc:Choice Requires="wps">
             <w:drawing>
-              <wp:anchor behindDoc="0" distT="40005" distB="60325" distL="109220" distR="125730" simplePos="0" locked="0" layoutInCell="0" allowOverlap="1" relativeHeight="2" wp14:anchorId="0DDCE53D">
+              <wp:anchor behindDoc="0" distT="40005" distB="59690" distL="109220" distR="125095" simplePos="0" locked="0" layoutInCell="0" allowOverlap="1" relativeHeight="2" wp14:anchorId="0DDCE53D">
                 <wp:simplePos x="0" y="0"/>
                 <wp:positionH relativeFrom="margin">
                   <wp:posOffset>-803910</wp:posOffset>
@@ -135,50 +124,34 @@
                               <w:spacing w:lineRule="auto" w:line="240" w:before="0" w:after="0"/>
                               <w:ind w:right="45" w:hanging="0"/>
                               <w:rPr>
-                                <w:i/>
-                                <w:i/>
-                                <w:iCs/>
+                                <w:i w:val="false"/>
+                                <w:i w:val="false"/>
+                                <w:iCs w:val="false"/>
                               </w:rPr>
                             </w:pPr>
                             <w:r>
                               <w:rPr>
-                                <w:i/>
-                                <w:iCs/>
-                                <w:color w:val="000000"/>
-                              </w:rPr>
-                              <w:t xml:space="preserve">Note: Both Enhancement 1 and 2 involved modification of the original prims_heuristic() function. This function was subsequently renamed to pruned_prims_heuristic() to reflect its </w:t>
-                            </w:r>
-                            <w:r>
-                              <w:rPr>
-                                <w:i/>
-                                <w:iCs/>
-                                <w:color w:val="000000"/>
-                              </w:rPr>
-                              <w:t>enhanced</w:t>
-                            </w:r>
-                            <w:r>
-                              <w:rPr>
-                                <w:i/>
-                                <w:iCs/>
-                                <w:color w:val="000000"/>
-                              </w:rPr>
-                              <w:t xml:space="preserve"> function</w:t>
-                            </w:r>
-                            <w:r>
-                              <w:rPr>
-                                <w:i/>
-                                <w:iCs/>
-                                <w:color w:val="000000"/>
-                              </w:rPr>
-                              <w:t>ality</w:t>
-                            </w:r>
-                            <w:r>
-                              <w:rPr>
-                                <w:i/>
-                                <w:iCs/>
-                                <w:color w:val="000000"/>
-                              </w:rPr>
-                              <w:t>.</w:t>
+                                <w:i w:val="false"/>
+                                <w:iCs w:val="false"/>
+                                <w:color w:val="000000"/>
+                              </w:rPr>
+                              <w:t xml:space="preserve">Enhancement 1 </w:t>
+                            </w:r>
+                            <w:r>
+                              <w:rPr>
+                                <w:i w:val="false"/>
+                                <w:iCs w:val="false"/>
+                                <w:color w:val="000000"/>
+                              </w:rPr>
+                              <w:t>(modification of the prims_heuristic() function)</w:t>
+                            </w:r>
+                            <w:r>
+                              <w:rPr>
+                                <w:i w:val="false"/>
+                                <w:iCs w:val="false"/>
+                                <w:color w:val="000000"/>
+                              </w:rPr>
+                              <w:t>: The final city in the minimum spanning tree (MST) (calculated from city zero) was used as the starting city, as opposed to a randomly generated one. This was done by modifying the algorithm used for calculating the MST heuristic value from a given node so that it also had the ability to return the MST itself. A boolean value was used to inform the function whether to return the MST itself or its heuristic value.</w:t>
                             </w:r>
                           </w:p>
                           <w:p>
@@ -187,15 +160,18 @@
                               <w:spacing w:lineRule="auto" w:line="240" w:before="0" w:after="0"/>
                               <w:ind w:right="45" w:hanging="0"/>
                               <w:rPr>
-                                <w:i/>
-                                <w:i/>
+                                <w:i w:val="false"/>
+                                <w:i w:val="false"/>
+                                <w:iCs w:val="false"/>
                               </w:rPr>
                             </w:pPr>
                             <w:r>
                               <w:rPr>
-                                <w:i/>
-                                <w:color w:val="000000"/>
-                              </w:rPr>
+                                <w:i w:val="false"/>
+                                <w:iCs w:val="false"/>
+                                <w:color w:val="000000"/>
+                              </w:rPr>
+                              <w:t>The MST connects cities in a way that minimises the path cost, so selecting this final city helped provide a consistently low score for all ten provided city files.</w:t>
                             </w:r>
                           </w:p>
                           <w:p>
@@ -215,7 +191,6 @@
                                 <w:iCs w:val="false"/>
                                 <w:color w:val="000000"/>
                               </w:rPr>
-                              <w:t>Enhancement 1: The final city in the minimum spanning tree (MST) (calculated from city zero) was used as the starting city, as opposed to a randomly generated one. This was done by modifying the algorithm used for calculating the MST heuristic value from a given node so that it also had the ability to return the MST itself. A boolean value was used to inform the function whether to return the MST itself or its heuristic value.</w:t>
                             </w:r>
                           </w:p>
                           <w:p>
@@ -235,7 +210,15 @@
                                 <w:iCs w:val="false"/>
                                 <w:color w:val="000000"/>
                               </w:rPr>
-                              <w:t>The MST connects cities in a way that minimises the path cost, so selecting this final city helped provide a consistently low score for all ten provided city files.</w:t>
+                              <w:t xml:space="preserve">Enhancement 2: </w:t>
+                            </w:r>
+                            <w:r>
+                              <w:rPr>
+                                <w:i w:val="false"/>
+                                <w:iCs w:val="false"/>
+                                <w:color w:val="000000"/>
+                              </w:rPr>
+                              <w:t>Memoization was used inside the IDA* algorithm function IDAStarTSP() to memoize the heuristic values and thereby save valuable compute time.</w:t>
                             </w:r>
                           </w:p>
                           <w:p>
@@ -255,54 +238,7 @@
                                 <w:iCs w:val="false"/>
                                 <w:color w:val="000000"/>
                               </w:rPr>
-                            </w:r>
-                          </w:p>
-                          <w:p>
-                            <w:pPr>
-                              <w:pStyle w:val="FrameContents"/>
-                              <w:spacing w:lineRule="auto" w:line="240" w:before="0" w:after="0"/>
-                              <w:ind w:right="45" w:hanging="0"/>
-                              <w:rPr>
-                                <w:i w:val="false"/>
-                                <w:i w:val="false"/>
-                                <w:iCs w:val="false"/>
-                              </w:rPr>
-                            </w:pPr>
-                            <w:r>
-                              <w:rPr>
-                                <w:i w:val="false"/>
-                                <w:iCs w:val="false"/>
-                                <w:color w:val="000000"/>
-                              </w:rPr>
-                              <w:t>Enhancement 2: Heap pruning was used on the MST heuristic calculation to skip over unnecessary computations.</w:t>
-                            </w:r>
-                          </w:p>
-                          <w:p>
-                            <w:pPr>
-                              <w:pStyle w:val="FrameContents"/>
-                              <w:spacing w:lineRule="auto" w:line="240" w:before="0" w:after="0"/>
-                              <w:ind w:right="45" w:hanging="0"/>
-                              <w:rPr>
-                                <w:i w:val="false"/>
-                                <w:i w:val="false"/>
-                                <w:iCs w:val="false"/>
-                              </w:rPr>
-                            </w:pPr>
-                            <w:r>
-                              <w:rPr>
-                                <w:i w:val="false"/>
-                                <w:iCs w:val="false"/>
-                                <w:color w:val="000000"/>
-                              </w:rPr>
-                              <w:t xml:space="preserve"> </w:t>
-                            </w:r>
-                            <w:r>
-                              <w:rPr>
-                                <w:i w:val="false"/>
-                                <w:iCs w:val="false"/>
-                                <w:color w:val="000000"/>
-                              </w:rPr>
-                              <w:t xml:space="preserve">This was done by checking that the city was already present in the MST prior to and skipping over the rest of the loop if it was. </w:t>
+                              <w:t>This was done by creating a dictionary called mst_heuristic_memo, which serves as a cache to store previously computed heuristic values, preventing the recompute values which had already been found. During the depth-limited A* search performed inside the second while loop, the algorithm checks if the heuristic value has already been computed. If it has, its retrieved from the dictionary and reused, avoiding redundant calculations.</w:t>
                             </w:r>
                           </w:p>
                         </w:txbxContent>
@@ -329,50 +265,34 @@
                         <w:spacing w:lineRule="auto" w:line="240" w:before="0" w:after="0"/>
                         <w:ind w:right="45" w:hanging="0"/>
                         <w:rPr>
-                          <w:i/>
-                          <w:i/>
-                          <w:iCs/>
+                          <w:i w:val="false"/>
+                          <w:i w:val="false"/>
+                          <w:iCs w:val="false"/>
                         </w:rPr>
                       </w:pPr>
                       <w:r>
                         <w:rPr>
-                          <w:i/>
-                          <w:iCs/>
-                          <w:color w:val="000000"/>
-                        </w:rPr>
-                        <w:t xml:space="preserve">Note: Both Enhancement 1 and 2 involved modification of the original prims_heuristic() function. This function was subsequently renamed to pruned_prims_heuristic() to reflect its </w:t>
-                      </w:r>
-                      <w:r>
-                        <w:rPr>
-                          <w:i/>
-                          <w:iCs/>
-                          <w:color w:val="000000"/>
-                        </w:rPr>
-                        <w:t>enhanced</w:t>
-                      </w:r>
-                      <w:r>
-                        <w:rPr>
-                          <w:i/>
-                          <w:iCs/>
-                          <w:color w:val="000000"/>
-                        </w:rPr>
-                        <w:t xml:space="preserve"> function</w:t>
-                      </w:r>
-                      <w:r>
-                        <w:rPr>
-                          <w:i/>
-                          <w:iCs/>
-                          <w:color w:val="000000"/>
-                        </w:rPr>
-                        <w:t>ality</w:t>
-                      </w:r>
-                      <w:r>
-                        <w:rPr>
-                          <w:i/>
-                          <w:iCs/>
-                          <w:color w:val="000000"/>
-                        </w:rPr>
-                        <w:t>.</w:t>
+                          <w:i w:val="false"/>
+                          <w:iCs w:val="false"/>
+                          <w:color w:val="000000"/>
+                        </w:rPr>
+                        <w:t xml:space="preserve">Enhancement 1 </w:t>
+                      </w:r>
+                      <w:r>
+                        <w:rPr>
+                          <w:i w:val="false"/>
+                          <w:iCs w:val="false"/>
+                          <w:color w:val="000000"/>
+                        </w:rPr>
+                        <w:t>(modification of the prims_heuristic() function)</w:t>
+                      </w:r>
+                      <w:r>
+                        <w:rPr>
+                          <w:i w:val="false"/>
+                          <w:iCs w:val="false"/>
+                          <w:color w:val="000000"/>
+                        </w:rPr>
+                        <w:t>: The final city in the minimum spanning tree (MST) (calculated from city zero) was used as the starting city, as opposed to a randomly generated one. This was done by modifying the algorithm used for calculating the MST heuristic value from a given node so that it also had the ability to return the MST itself. A boolean value was used to inform the function whether to return the MST itself or its heuristic value.</w:t>
                       </w:r>
                     </w:p>
                     <w:p>
@@ -381,15 +301,18 @@
                         <w:spacing w:lineRule="auto" w:line="240" w:before="0" w:after="0"/>
                         <w:ind w:right="45" w:hanging="0"/>
                         <w:rPr>
-                          <w:i/>
-                          <w:i/>
+                          <w:i w:val="false"/>
+                          <w:i w:val="false"/>
+                          <w:iCs w:val="false"/>
                         </w:rPr>
                       </w:pPr>
                       <w:r>
                         <w:rPr>
-                          <w:i/>
-                          <w:color w:val="000000"/>
-                        </w:rPr>
+                          <w:i w:val="false"/>
+                          <w:iCs w:val="false"/>
+                          <w:color w:val="000000"/>
+                        </w:rPr>
+                        <w:t>The MST connects cities in a way that minimises the path cost, so selecting this final city helped provide a consistently low score for all ten provided city files.</w:t>
                       </w:r>
                     </w:p>
                     <w:p>
@@ -409,7 +332,6 @@
                           <w:iCs w:val="false"/>
                           <w:color w:val="000000"/>
                         </w:rPr>
-                        <w:t>Enhancement 1: The final city in the minimum spanning tree (MST) (calculated from city zero) was used as the starting city, as opposed to a randomly generated one. This was done by modifying the algorithm used for calculating the MST heuristic value from a given node so that it also had the ability to return the MST itself. A boolean value was used to inform the function whether to return the MST itself or its heuristic value.</w:t>
                       </w:r>
                     </w:p>
                     <w:p>
@@ -429,7 +351,15 @@
                           <w:iCs w:val="false"/>
                           <w:color w:val="000000"/>
                         </w:rPr>
-                        <w:t>The MST connects cities in a way that minimises the path cost, so selecting this final city helped provide a consistently low score for all ten provided city files.</w:t>
+                        <w:t xml:space="preserve">Enhancement 2: </w:t>
+                      </w:r>
+                      <w:r>
+                        <w:rPr>
+                          <w:i w:val="false"/>
+                          <w:iCs w:val="false"/>
+                          <w:color w:val="000000"/>
+                        </w:rPr>
+                        <w:t>Memoization was used inside the IDA* algorithm function IDAStarTSP() to memoize the heuristic values and thereby save valuable compute time.</w:t>
                       </w:r>
                     </w:p>
                     <w:p>
@@ -449,54 +379,7 @@
                           <w:iCs w:val="false"/>
                           <w:color w:val="000000"/>
                         </w:rPr>
-                      </w:r>
-                    </w:p>
-                    <w:p>
-                      <w:pPr>
-                        <w:pStyle w:val="FrameContents"/>
-                        <w:spacing w:lineRule="auto" w:line="240" w:before="0" w:after="0"/>
-                        <w:ind w:right="45" w:hanging="0"/>
-                        <w:rPr>
-                          <w:i w:val="false"/>
-                          <w:i w:val="false"/>
-                          <w:iCs w:val="false"/>
-                        </w:rPr>
-                      </w:pPr>
-                      <w:r>
-                        <w:rPr>
-                          <w:i w:val="false"/>
-                          <w:iCs w:val="false"/>
-                          <w:color w:val="000000"/>
-                        </w:rPr>
-                        <w:t>Enhancement 2: Heap pruning was used on the MST heuristic calculation to skip over unnecessary computations.</w:t>
-                      </w:r>
-                    </w:p>
-                    <w:p>
-                      <w:pPr>
-                        <w:pStyle w:val="FrameContents"/>
-                        <w:spacing w:lineRule="auto" w:line="240" w:before="0" w:after="0"/>
-                        <w:ind w:right="45" w:hanging="0"/>
-                        <w:rPr>
-                          <w:i w:val="false"/>
-                          <w:i w:val="false"/>
-                          <w:iCs w:val="false"/>
-                        </w:rPr>
-                      </w:pPr>
-                      <w:r>
-                        <w:rPr>
-                          <w:i w:val="false"/>
-                          <w:iCs w:val="false"/>
-                          <w:color w:val="000000"/>
-                        </w:rPr>
-                        <w:t xml:space="preserve"> </w:t>
-                      </w:r>
-                      <w:r>
-                        <w:rPr>
-                          <w:i w:val="false"/>
-                          <w:iCs w:val="false"/>
-                          <w:color w:val="000000"/>
-                        </w:rPr>
-                        <w:t xml:space="preserve">This was done by checking that the city was already present in the MST prior to and skipping over the rest of the loop if it was. </w:t>
+                        <w:t>This was done by creating a dictionary called mst_heuristic_memo, which serves as a cache to store previously computed heuristic values, preventing the recompute values which had already been found. During the depth-limited A* search performed inside the second while loop, the algorithm checks if the heuristic value has already been computed. If it has, its retrieved from the dictionary and reused, avoiding redundant calculations.</w:t>
                       </w:r>
                     </w:p>
                   </w:txbxContent>
@@ -527,7 +410,7 @@
         <mc:AlternateContent>
           <mc:Choice Requires="wps">
             <w:drawing>
-              <wp:anchor behindDoc="0" distT="36830" distB="62865" distL="109220" distR="118110" simplePos="0" locked="0" layoutInCell="0" allowOverlap="1" relativeHeight="4" wp14:anchorId="395F7EF3">
+              <wp:anchor behindDoc="0" distT="36195" distB="62865" distL="109220" distR="117475" simplePos="0" locked="0" layoutInCell="0" allowOverlap="1" relativeHeight="4" wp14:anchorId="395F7EF3">
                 <wp:simplePos x="0" y="0"/>
                 <wp:positionH relativeFrom="margin">
                   <wp:posOffset>-811530</wp:posOffset>
@@ -731,7 +614,23 @@
                                 <w:iCs w:val="false"/>
                                 <w:color w:val="000000"/>
                               </w:rPr>
-                              <w:t xml:space="preserve">Enhancement 2: Inspired by the paper by Chaing, et al., (2016) (DOI here: http://dx.doi.org/10.1109/ICMLC.2016.7872949), Algorithm B was enhanced by adding a function to implement the 2-OPT technique, which modified the global </w:t>
+                              <w:t xml:space="preserve">Enhancement 2: Inspired by the paper by Chaing, et al., (2016) (DOI here: http://dx.doi.org/10.1109/ICMLC.2016.7872949), Algorithm B was enhanced by adding a function to implement the 2-OPT technique. </w:t>
+                            </w:r>
+                            <w:r>
+                              <w:rPr>
+                                <w:i w:val="false"/>
+                                <w:iCs w:val="false"/>
+                                <w:color w:val="000000"/>
+                              </w:rPr>
+                              <w:t xml:space="preserve">In this enhancement, </w:t>
+                            </w:r>
+                            <w:r>
+                              <w:rPr>
+                                <w:i w:val="false"/>
+                                <w:iCs w:val="false"/>
+                                <w:color w:val="000000"/>
+                              </w:rPr>
+                              <w:t xml:space="preserve">the global </w:t>
                             </w:r>
                             <w:r>
                               <w:rPr>
@@ -747,7 +646,100 @@
                                 <w:iCs w:val="false"/>
                                 <w:color w:val="000000"/>
                               </w:rPr>
-                              <w:t xml:space="preserve"> variable to obtain an enhanced tour. 2-OPT works by iterating over all the pairs edges in the tour and examining whether reversing the order of two cities in the tour would result in a tour with a lower path cost. If it would, the tour is subsequently modified to reflect the swap. Combined with enhancments 1A and 1B, this greatly improved tour quality, with the quality of tours found from the enhanced greedy algorithm now being on a similar level to the quality of tours discovered with the iterative depeening A* search.</w:t>
+                              <w:t xml:space="preserve"> variable </w:t>
+                            </w:r>
+                            <w:r>
+                              <w:rPr>
+                                <w:i w:val="false"/>
+                                <w:iCs w:val="false"/>
+                                <w:color w:val="000000"/>
+                              </w:rPr>
+                              <w:t xml:space="preserve">was modified inside this algorithm </w:t>
+                            </w:r>
+                            <w:r>
+                              <w:rPr>
+                                <w:i w:val="false"/>
+                                <w:iCs w:val="false"/>
+                                <w:color w:val="000000"/>
+                              </w:rPr>
+                              <w:t xml:space="preserve">to </w:t>
+                            </w:r>
+                            <w:r>
+                              <w:rPr>
+                                <w:i w:val="false"/>
+                                <w:iCs w:val="false"/>
+                                <w:color w:val="000000"/>
+                              </w:rPr>
+                              <w:t>produce</w:t>
+                            </w:r>
+                            <w:r>
+                              <w:rPr>
+                                <w:i w:val="false"/>
+                                <w:iCs w:val="false"/>
+                                <w:color w:val="000000"/>
+                              </w:rPr>
+                              <w:t xml:space="preserve"> a </w:t>
+                            </w:r>
+                            <w:r>
+                              <w:rPr>
+                                <w:i w:val="false"/>
+                                <w:iCs w:val="false"/>
+                                <w:color w:val="000000"/>
+                              </w:rPr>
+                              <w:t>tour with shorter path length</w:t>
+                            </w:r>
+                            <w:r>
+                              <w:rPr>
+                                <w:i w:val="false"/>
+                                <w:iCs w:val="false"/>
+                                <w:color w:val="000000"/>
+                              </w:rPr>
+                              <w:t xml:space="preserve">. </w:t>
+                            </w:r>
+                          </w:p>
+                          <w:p>
+                            <w:pPr>
+                              <w:pStyle w:val="FrameContents"/>
+                              <w:spacing w:lineRule="auto" w:line="240" w:before="0" w:after="0"/>
+                              <w:ind w:right="45" w:hanging="0"/>
+                              <w:rPr>
+                                <w:i w:val="false"/>
+                                <w:i w:val="false"/>
+                                <w:iCs w:val="false"/>
+                                <w:color w:val="000000"/>
+                              </w:rPr>
+                            </w:pPr>
+                            <w:r>
+                              <w:rPr/>
+                            </w:r>
+                          </w:p>
+                          <w:p>
+                            <w:pPr>
+                              <w:pStyle w:val="FrameContents"/>
+                              <w:spacing w:lineRule="auto" w:line="240" w:before="0" w:after="0"/>
+                              <w:ind w:right="45" w:hanging="0"/>
+                              <w:rPr>
+                                <w:i w:val="false"/>
+                                <w:i w:val="false"/>
+                                <w:iCs w:val="false"/>
+                                <w:color w:val="000000"/>
+                              </w:rPr>
+                            </w:pPr>
+                            <w:r>
+                              <w:rPr>
+                                <w:i w:val="false"/>
+                                <w:iCs w:val="false"/>
+                                <w:color w:val="000000"/>
+                              </w:rPr>
+                              <w:t xml:space="preserve">2-OPT works by iterating over all the pairs edges in the tour and examining whether reversing the order of two cities in the tour would result in a tour with a lower path cost. If it would, the tour is subsequently modified to reflect the swap. Combined with enhancments 1A and 1B, this greatly improved tour quality, with the quality of tours found from the enhanced greedy algorithm </w:t>
+                            </w:r>
+                            <w:r>
+                              <w:rPr>
+                                <w:i w:val="false"/>
+                                <w:iCs w:val="false"/>
+                                <w:color w:val="000000"/>
+                              </w:rPr>
+                              <w:t>on poor with that of the iterative deepening A* search.</w:t>
                             </w:r>
                           </w:p>
                         </w:txbxContent>
@@ -930,7 +922,23 @@
                           <w:iCs w:val="false"/>
                           <w:color w:val="000000"/>
                         </w:rPr>
-                        <w:t xml:space="preserve">Enhancement 2: Inspired by the paper by Chaing, et al., (2016) (DOI here: http://dx.doi.org/10.1109/ICMLC.2016.7872949), Algorithm B was enhanced by adding a function to implement the 2-OPT technique, which modified the global </w:t>
+                        <w:t xml:space="preserve">Enhancement 2: Inspired by the paper by Chaing, et al., (2016) (DOI here: http://dx.doi.org/10.1109/ICMLC.2016.7872949), Algorithm B was enhanced by adding a function to implement the 2-OPT technique. </w:t>
+                      </w:r>
+                      <w:r>
+                        <w:rPr>
+                          <w:i w:val="false"/>
+                          <w:iCs w:val="false"/>
+                          <w:color w:val="000000"/>
+                        </w:rPr>
+                        <w:t xml:space="preserve">In this enhancement, </w:t>
+                      </w:r>
+                      <w:r>
+                        <w:rPr>
+                          <w:i w:val="false"/>
+                          <w:iCs w:val="false"/>
+                          <w:color w:val="000000"/>
+                        </w:rPr>
+                        <w:t xml:space="preserve">the global </w:t>
                       </w:r>
                       <w:r>
                         <w:rPr>
@@ -946,7 +954,100 @@
                           <w:iCs w:val="false"/>
                           <w:color w:val="000000"/>
                         </w:rPr>
-                        <w:t xml:space="preserve"> variable to obtain an enhanced tour. 2-OPT works by iterating over all the pairs edges in the tour and examining whether reversing the order of two cities in the tour would result in a tour with a lower path cost. If it would, the tour is subsequently modified to reflect the swap. Combined with enhancments 1A and 1B, this greatly improved tour quality, with the quality of tours found from the enhanced greedy algorithm now being on a similar level to the quality of tours discovered with the iterative depeening A* search.</w:t>
+                        <w:t xml:space="preserve"> variable </w:t>
+                      </w:r>
+                      <w:r>
+                        <w:rPr>
+                          <w:i w:val="false"/>
+                          <w:iCs w:val="false"/>
+                          <w:color w:val="000000"/>
+                        </w:rPr>
+                        <w:t xml:space="preserve">was modified inside this algorithm </w:t>
+                      </w:r>
+                      <w:r>
+                        <w:rPr>
+                          <w:i w:val="false"/>
+                          <w:iCs w:val="false"/>
+                          <w:color w:val="000000"/>
+                        </w:rPr>
+                        <w:t xml:space="preserve">to </w:t>
+                      </w:r>
+                      <w:r>
+                        <w:rPr>
+                          <w:i w:val="false"/>
+                          <w:iCs w:val="false"/>
+                          <w:color w:val="000000"/>
+                        </w:rPr>
+                        <w:t>produce</w:t>
+                      </w:r>
+                      <w:r>
+                        <w:rPr>
+                          <w:i w:val="false"/>
+                          <w:iCs w:val="false"/>
+                          <w:color w:val="000000"/>
+                        </w:rPr>
+                        <w:t xml:space="preserve"> a </w:t>
+                      </w:r>
+                      <w:r>
+                        <w:rPr>
+                          <w:i w:val="false"/>
+                          <w:iCs w:val="false"/>
+                          <w:color w:val="000000"/>
+                        </w:rPr>
+                        <w:t>tour with shorter path length</w:t>
+                      </w:r>
+                      <w:r>
+                        <w:rPr>
+                          <w:i w:val="false"/>
+                          <w:iCs w:val="false"/>
+                          <w:color w:val="000000"/>
+                        </w:rPr>
+                        <w:t xml:space="preserve">. </w:t>
+                      </w:r>
+                    </w:p>
+                    <w:p>
+                      <w:pPr>
+                        <w:pStyle w:val="FrameContents"/>
+                        <w:spacing w:lineRule="auto" w:line="240" w:before="0" w:after="0"/>
+                        <w:ind w:right="45" w:hanging="0"/>
+                        <w:rPr>
+                          <w:i w:val="false"/>
+                          <w:i w:val="false"/>
+                          <w:iCs w:val="false"/>
+                          <w:color w:val="000000"/>
+                        </w:rPr>
+                      </w:pPr>
+                      <w:r>
+                        <w:rPr/>
+                      </w:r>
+                    </w:p>
+                    <w:p>
+                      <w:pPr>
+                        <w:pStyle w:val="FrameContents"/>
+                        <w:spacing w:lineRule="auto" w:line="240" w:before="0" w:after="0"/>
+                        <w:ind w:right="45" w:hanging="0"/>
+                        <w:rPr>
+                          <w:i w:val="false"/>
+                          <w:i w:val="false"/>
+                          <w:iCs w:val="false"/>
+                          <w:color w:val="000000"/>
+                        </w:rPr>
+                      </w:pPr>
+                      <w:r>
+                        <w:rPr>
+                          <w:i w:val="false"/>
+                          <w:iCs w:val="false"/>
+                          <w:color w:val="000000"/>
+                        </w:rPr>
+                        <w:t xml:space="preserve">2-OPT works by iterating over all the pairs edges in the tour and examining whether reversing the order of two cities in the tour would result in a tour with a lower path cost. If it would, the tour is subsequently modified to reflect the swap. Combined with enhancments 1A and 1B, this greatly improved tour quality, with the quality of tours found from the enhanced greedy algorithm </w:t>
+                      </w:r>
+                      <w:r>
+                        <w:rPr>
+                          <w:i w:val="false"/>
+                          <w:iCs w:val="false"/>
+                          <w:color w:val="000000"/>
+                        </w:rPr>
+                        <w:t>on poor with that of the iterative deepening A* search.</w:t>
                       </w:r>
                     </w:p>
                   </w:txbxContent>
@@ -1018,7 +1119,7 @@
         <mc:AlternateContent>
           <mc:Choice Requires="wps">
             <w:drawing>
-              <wp:anchor behindDoc="0" distT="40005" distB="64135" distL="105410" distR="124460" simplePos="0" locked="0" layoutInCell="0" allowOverlap="1" relativeHeight="6" wp14:anchorId="7F7DBDF3">
+              <wp:anchor behindDoc="0" distT="40005" distB="64135" distL="104775" distR="124460" simplePos="0" locked="0" layoutInCell="0" allowOverlap="1" relativeHeight="6" wp14:anchorId="7F7DBDF3">
                 <wp:simplePos x="0" y="0"/>
                 <wp:positionH relativeFrom="margin">
                   <wp:posOffset>-819150</wp:posOffset>

</xml_diff>